<commit_message>
Add conference diagrams and worked benchmark example
</commit_message>
<xml_diff>
--- a/CloudGuard_Conference_Manuscript_Guide.docx
+++ b/CloudGuard_Conference_Manuscript_Guide.docx
@@ -1398,6 +1398,282 @@
         <w:t>The base paper motivates the need to analyze security-policy violations consistently and to compare policy semantics across tools in a Helm/Kubernetes setting. CloudGuard transfers the traceability idea to AWS Terraform and CloudFormation. The relationship is therefore conceptual and methodological; CloudGuard is not a reimplementation of the base paper's Helm system.</w:t>
       </w:r>
     </w:p>
+    <w:p>
+      <w:pPr>
+        <w:pStyle w:val="Heading1"/>
+      </w:pPr>
+      <w:r>
+        <w:t>14 Worked Benchmark Example</w:t>
+      </w:r>
+    </w:p>
+    <w:p>
+      <w:r>
+        <w:t>The file tf_006 demonstrates how the benchmark decides expected_violation. Its Terraform source contains publicly_accessible = true and storage_encrypted = true.</w:t>
+      </w:r>
+    </w:p>
+    <w:tbl>
+      <w:tblPr>
+        <w:tblStyle w:val="TableGrid"/>
+        <w:tblW w:type="auto" w:w="0"/>
+        <w:jc w:val="center"/>
+        <w:tblLook w:firstColumn="1" w:firstRow="1" w:lastColumn="0" w:lastRow="0" w:noHBand="0" w:noVBand="1" w:val="04A0"/>
+        <w:tblBorders>
+          <w:top w:val="single" w:sz="4" w:color="D9E2F3"/>
+          <w:left w:val="single" w:sz="4" w:color="D9E2F3"/>
+          <w:bottom w:val="single" w:sz="4" w:color="D9E2F3"/>
+          <w:right w:val="single" w:sz="4" w:color="D9E2F3"/>
+          <w:insideH w:val="single" w:sz="4" w:color="D9E2F3"/>
+          <w:insideV w:val="single" w:sz="4" w:color="D9E2F3"/>
+        </w:tblBorders>
+      </w:tblPr>
+      <w:tblGrid>
+        <w:gridCol w:w="2484"/>
+        <w:gridCol w:w="2484"/>
+        <w:gridCol w:w="2484"/>
+        <w:gridCol w:w="2484"/>
+      </w:tblGrid>
+      <w:tr>
+        <w:tc>
+          <w:tcPr>
+            <w:tcW w:type="dxa" w:w="2484"/>
+            <w:shd w:fill="1F4E79"/>
+            <w:vAlign w:val="center"/>
+          </w:tcPr>
+          <w:p>
+            <w:r>
+              <w:rPr>
+                <w:b/>
+                <w:color w:val="FFFFFF"/>
+              </w:rPr>
+              <w:t>Policy instance</w:t>
+            </w:r>
+          </w:p>
+        </w:tc>
+        <w:tc>
+          <w:tcPr>
+            <w:tcW w:type="dxa" w:w="2484"/>
+            <w:shd w:fill="1F4E79"/>
+            <w:vAlign w:val="center"/>
+          </w:tcPr>
+          <w:p>
+            <w:r>
+              <w:rPr>
+                <w:b/>
+                <w:color w:val="FFFFFF"/>
+              </w:rPr>
+              <w:t>Source condition</w:t>
+            </w:r>
+          </w:p>
+        </w:tc>
+        <w:tc>
+          <w:tcPr>
+            <w:tcW w:type="dxa" w:w="2484"/>
+            <w:shd w:fill="1F4E79"/>
+            <w:vAlign w:val="center"/>
+          </w:tcPr>
+          <w:p>
+            <w:r>
+              <w:rPr>
+                <w:b/>
+                <w:color w:val="FFFFFF"/>
+              </w:rPr>
+              <w:t>Expected value</w:t>
+            </w:r>
+          </w:p>
+        </w:tc>
+        <w:tc>
+          <w:tcPr>
+            <w:tcW w:type="dxa" w:w="2484"/>
+            <w:shd w:fill="1F4E79"/>
+            <w:vAlign w:val="center"/>
+          </w:tcPr>
+          <w:p>
+            <w:r>
+              <w:rPr>
+                <w:b/>
+                <w:color w:val="FFFFFF"/>
+              </w:rPr>
+              <w:t>Reason</w:t>
+            </w:r>
+          </w:p>
+        </w:tc>
+      </w:tr>
+      <w:tr>
+        <w:tc>
+          <w:tcPr>
+            <w:tcW w:type="dxa" w:w="2484"/>
+            <w:vAlign w:val="center"/>
+            <w:shd w:fill="F4F7FB"/>
+          </w:tcPr>
+          <w:p>
+            <w:r>
+              <w:t>POL_AWS_RDS_PUBLIC</w:t>
+            </w:r>
+          </w:p>
+        </w:tc>
+        <w:tc>
+          <w:tcPr>
+            <w:tcW w:type="dxa" w:w="2484"/>
+            <w:vAlign w:val="center"/>
+            <w:shd w:fill="F4F7FB"/>
+          </w:tcPr>
+          <w:p>
+            <w:r>
+              <w:t>publicly_accessible = true</w:t>
+            </w:r>
+          </w:p>
+        </w:tc>
+        <w:tc>
+          <w:tcPr>
+            <w:tcW w:type="dxa" w:w="2484"/>
+            <w:vAlign w:val="center"/>
+            <w:shd w:fill="F4F7FB"/>
+          </w:tcPr>
+          <w:p>
+            <w:r>
+              <w:t>1</w:t>
+            </w:r>
+          </w:p>
+        </w:tc>
+        <w:tc>
+          <w:tcPr>
+            <w:tcW w:type="dxa" w:w="2484"/>
+            <w:vAlign w:val="center"/>
+            <w:shd w:fill="F4F7FB"/>
+          </w:tcPr>
+          <w:p>
+            <w:r>
+              <w:t>The database is configured as publicly accessible</w:t>
+            </w:r>
+          </w:p>
+        </w:tc>
+      </w:tr>
+      <w:tr>
+        <w:tc>
+          <w:tcPr>
+            <w:tcW w:type="dxa" w:w="2484"/>
+            <w:vAlign w:val="center"/>
+          </w:tcPr>
+          <w:p>
+            <w:r>
+              <w:t>POL_AWS_RDS_ENCRYPTION</w:t>
+            </w:r>
+          </w:p>
+        </w:tc>
+        <w:tc>
+          <w:tcPr>
+            <w:tcW w:type="dxa" w:w="2484"/>
+            <w:vAlign w:val="center"/>
+          </w:tcPr>
+          <w:p>
+            <w:r>
+              <w:t>storage_encrypted = true</w:t>
+            </w:r>
+          </w:p>
+        </w:tc>
+        <w:tc>
+          <w:tcPr>
+            <w:tcW w:type="dxa" w:w="2484"/>
+            <w:vAlign w:val="center"/>
+          </w:tcPr>
+          <w:p>
+            <w:r>
+              <w:t>0</w:t>
+            </w:r>
+          </w:p>
+        </w:tc>
+        <w:tc>
+          <w:tcPr>
+            <w:tcW w:type="dxa" w:w="2484"/>
+            <w:vAlign w:val="center"/>
+          </w:tcPr>
+          <w:p>
+            <w:r>
+              <w:t>The safe encryption condition is present</w:t>
+            </w:r>
+          </w:p>
+        </w:tc>
+      </w:tr>
+    </w:tbl>
+    <w:p>
+      <w:r>
+        <w:t>The ground-truth value is decided before scanner comparison by applying the predefined policy criterion to the source. The scanners then produce predictions. For this file, CloudGuard, Checkov, KICS, and Trivy should all predict one for public RDS and zero for disabled encryption after their native rule IDs are mapped to the common CloudGuard SIDs.</w:t>
+      </w:r>
+    </w:p>
+    <w:p>
+      <w:pPr>
+        <w:pStyle w:val="Heading1"/>
+      </w:pPr>
+      <w:r>
+        <w:t>15 Scanner Comparison Process</w:t>
+      </w:r>
+    </w:p>
+    <w:p>
+      <w:pPr>
+        <w:pStyle w:val="ListNumber"/>
+      </w:pPr>
+      <w:r>
+        <w:t>Run every scanner on exactly the same frozen benchmark files.</w:t>
+      </w:r>
+    </w:p>
+    <w:p>
+      <w:pPr>
+        <w:pStyle w:val="ListNumber"/>
+      </w:pPr>
+      <w:r>
+        <w:t>Retain the tool version, command, raw JSON output, and scan date.</w:t>
+      </w:r>
+    </w:p>
+    <w:p>
+      <w:pPr>
+        <w:pStyle w:val="ListNumber"/>
+      </w:pPr>
+      <w:r>
+        <w:t>Map native rule IDs to CloudGuard SIDs only when their conditions are semantically equivalent.</w:t>
+      </w:r>
+    </w:p>
+    <w:p>
+      <w:pPr>
+        <w:pStyle w:val="ListNumber"/>
+      </w:pPr>
+      <w:r>
+        <w:t>Normalize every finding to file_id, resource_id, policy_sid, violation, and tool.</w:t>
+      </w:r>
+    </w:p>
+    <w:p>
+      <w:pPr>
+        <w:pStyle w:val="ListNumber"/>
+      </w:pPr>
+      <w:r>
+        <w:t>Join normalized predictions with consensus.csv.</w:t>
+      </w:r>
+    </w:p>
+    <w:p>
+      <w:pPr>
+        <w:pStyle w:val="ListNumber"/>
+      </w:pPr>
+      <w:r>
+        <w:t>Calculate TP, FP, FN, TN, precision, recall, F1, and coverage.</w:t>
+      </w:r>
+    </w:p>
+    <w:p>
+      <w:r>
+        <w:t>Coverage is calculated separately because a scanner may not have an equivalent validated rule for every policy instance. An unmapped instance is excluded from that scanner's denominator; it is not silently counted as a true negative.</w:t>
+      </w:r>
+    </w:p>
+    <w:p>
+      <w:pPr>
+        <w:pStyle w:val="Heading1"/>
+      </w:pPr>
+      <w:r>
+        <w:t>16 Evidence Chain</w:t>
+      </w:r>
+    </w:p>
+    <w:p>
+      <w:r>
+        <w:t>The complete evidence chain is: source files, policy criteria, ground-truth labels, raw scanner outputs, semantic mapping, normalized predictions, confusion matrices, and generated metrics. This sequence lets a reviewer trace a reported number back to an actual configuration and rule decision.</w:t>
+      </w:r>
+    </w:p>
     <w:sectPr>
       <w:pgSz w:w="12240" w:h="15840"/>
       <w:pgMar w:top="1008" w:right="1152" w:bottom="1008" w:left="1152" w:header="720" w:footer="720" w:gutter="0"/>

</xml_diff>